<commit_message>
docs: align resume and validation scope with Qwen3-8B
</commit_message>
<xml_diff>
--- a/docs/RESUME.zh.docx
+++ b/docs/RESUME.zh.docx
@@ -35,12 +35,6 @@
       <w:r>
         <w:rPr>
           <w:rFonts w:ascii="Songti SC" w:hAnsi="Songti SC" w:eastAsia="Songti SC" w:cs="Songti SC"/>
-          <w:b w:val="0"/>
-        </w:rPr>
-      </w:r>
-      <w:r>
-        <w:rPr>
-          <w:rFonts w:ascii="Songti SC" w:hAnsi="Songti SC" w:eastAsia="Songti SC" w:cs="Songti SC"/>
           <w:b/>
         </w:rPr>
         <w:t>项目概述：</w:t>
@@ -50,7 +44,7 @@
           <w:rFonts w:ascii="Songti SC" w:hAnsi="Songti SC" w:eastAsia="Songti SC" w:cs="Songti SC"/>
           <w:b w:val="0"/>
         </w:rPr>
-        <w:t xml:space="preserve"> 基于开源 MinivLLM 扩展 Qwen3-0.6B/8B 推理流程，围绕 Prefill/Decode、分页 KV Cache 和请求调度实现与验证优化；集成 Prefix Caching、Chunked Prefill、DFlash 批量投机解码与 Target CUDA Graph，并完成单机双卡 TP/DP/1P1D 对照。技术栈：Python、PyTorch、Triton、CUDA Graph、NCCL、AWQ。</w:t>
+        <w:t xml:space="preserve"> 基于开源 MinivLLM，面向 Qwen3-8B 优化 KV Cache 管理与请求调度，集成 Prefix Caching、Chunked Prefill、DFlash 批量投机解码与 Target CUDA Graph，并完成单卡及 TP2/DP2/1P1D 对照评测。技术栈：Python、PyTorch、Triton、CUDA Graph、NCCL、AWQ。</w:t>
       </w:r>
     </w:p>
     <w:p>

</xml_diff>